<commit_message>
chore(lab2): Update binary files and SQL scripts for database management
</commit_message>
<xml_diff>
--- a/lab2/Отчет.docx
+++ b/lab2/Отчет.docx
@@ -260,7 +260,6 @@
     <w:p>
       <w:pPr>
         <w:spacing w:line="240" w:lineRule="auto"/>
-        <w:ind w:firstLine="709"/>
         <w:contextualSpacing w:val="0"/>
         <w:jc w:val="center"/>
         <w:rPr>
@@ -408,13 +407,11 @@
       </w:r>
       <w:r>
         <w:tab/>
-        <w:t xml:space="preserve">студ. </w:t>
-      </w:r>
-      <w:proofErr w:type="spellStart"/>
-      <w:r>
-        <w:t>гр</w:t>
-      </w:r>
-      <w:proofErr w:type="spellEnd"/>
+        <w:t>студ. гр</w:t>
+      </w:r>
+      <w:r>
+        <w:t>.</w:t>
+      </w:r>
       <w:r>
         <w:t xml:space="preserve"> 320601</w:t>
       </w:r>
@@ -422,7 +419,7 @@
     <w:p>
       <w:pPr>
         <w:spacing w:line="240" w:lineRule="auto"/>
-        <w:ind w:left="6521" w:firstLine="559"/>
+        <w:ind w:left="6521" w:firstLine="567"/>
         <w:contextualSpacing w:val="0"/>
         <w:jc w:val="both"/>
         <w:rPr>
@@ -431,7 +428,10 @@
         </w:rPr>
       </w:pPr>
       <w:r>
-        <w:t>Образцов А.С.</w:t>
+        <w:t xml:space="preserve">А. С. </w:t>
+      </w:r>
+      <w:r>
+        <w:t xml:space="preserve">Образцов </w:t>
       </w:r>
     </w:p>
     <w:p>
@@ -467,7 +467,10 @@
         </w:rPr>
       </w:pPr>
       <w:r>
-        <w:t xml:space="preserve">Проверила: </w:t>
+        <w:t>Принял</w:t>
+      </w:r>
+      <w:r>
+        <w:t xml:space="preserve">: </w:t>
       </w:r>
       <w:r>
         <w:tab/>
@@ -493,14 +496,24 @@
       <w:r>
         <w:tab/>
       </w:r>
+      <w:r>
+        <w:tab/>
+      </w:r>
+      <w:r>
+        <w:t>Р. А.</w:t>
+      </w:r>
+      <w:r>
+        <w:rPr>
+          <w:rFonts w:eastAsia="Times New Roman" w:cs="Times New Roman"/>
+          <w:szCs w:val="28"/>
+        </w:rPr>
+        <w:t xml:space="preserve"> </w:t>
+      </w:r>
       <w:proofErr w:type="spellStart"/>
       <w:r>
         <w:t>Шабанович</w:t>
       </w:r>
       <w:proofErr w:type="spellEnd"/>
-      <w:r>
-        <w:t xml:space="preserve"> Р.А.</w:t>
-      </w:r>
     </w:p>
     <w:p>
       <w:pPr>
@@ -578,14 +591,25 @@
     </w:p>
     <w:p>
       <w:pPr>
-        <w:jc w:val="center"/>
         <w:rPr>
           <w:rFonts w:eastAsia="Times New Roman" w:cs="Times New Roman"/>
           <w:szCs w:val="28"/>
         </w:rPr>
       </w:pPr>
-      <w:r>
-        <w:t>Минск 2025</w:t>
+    </w:p>
+    <w:p>
+      <w:pPr>
+        <w:jc w:val="center"/>
+        <w:rPr>
+          <w:rFonts w:eastAsia="Times New Roman" w:cs="Times New Roman"/>
+          <w:szCs w:val="28"/>
+        </w:rPr>
+      </w:pPr>
+      <w:r>
+        <w:t>Минск 202</w:t>
+      </w:r>
+      <w:r>
+        <w:t>6</w:t>
       </w:r>
     </w:p>
     <w:p>
@@ -765,7 +789,13 @@
         <w:t>TEMPDB</w:t>
       </w:r>
       <w:r>
-        <w:t xml:space="preserve"> — системная база данных </w:t>
+        <w:t xml:space="preserve"> </w:t>
+      </w:r>
+      <w:r>
+        <w:t>–</w:t>
+      </w:r>
+      <w:r>
+        <w:t xml:space="preserve"> системная база данных </w:t>
       </w:r>
       <w:r>
         <w:rPr>
@@ -1140,7 +1170,13 @@
       </w:r>
       <w:proofErr w:type="spellEnd"/>
       <w:r>
-        <w:t xml:space="preserve"> — это именованная группа файлов данных (.</w:t>
+        <w:t xml:space="preserve"> </w:t>
+      </w:r>
+      <w:r>
+        <w:t>–</w:t>
+      </w:r>
+      <w:r>
+        <w:t xml:space="preserve"> это именованная группа файлов данных (.</w:t>
       </w:r>
       <w:proofErr w:type="spellStart"/>
       <w:r>
@@ -1437,7 +1473,21 @@
       </w:r>
       <w:proofErr w:type="spellEnd"/>
       <w:r>
-        <w:t xml:space="preserve"> — монтирование конкретного каталога с хоста в контейнер (например, ./</w:t>
+        <w:t xml:space="preserve"> </w:t>
+      </w:r>
+      <w:r>
+        <w:t>–</w:t>
+      </w:r>
+      <w:r>
+        <w:t xml:space="preserve"> монтирование конкретного каталога с хоста в контейнер (например</w:t>
+      </w:r>
+      <w:proofErr w:type="gramStart"/>
+      <w:r>
+        <w:t>, .</w:t>
+      </w:r>
+      <w:proofErr w:type="gramEnd"/>
+      <w:r>
+        <w:t>/</w:t>
       </w:r>
       <w:proofErr w:type="spellStart"/>
       <w:r>
@@ -2701,6 +2751,9 @@
         <w:jc w:val="center"/>
       </w:pPr>
       <w:r>
+        <w:rPr>
+          <w:noProof/>
+        </w:rPr>
         <w:lastRenderedPageBreak/>
         <w:drawing>
           <wp:inline distT="0" distB="0" distL="0" distR="0" wp14:anchorId="39DE6A6F" wp14:editId="24A5E9C9">
@@ -2772,6 +2825,9 @@
         <w:jc w:val="center"/>
       </w:pPr>
       <w:r>
+        <w:rPr>
+          <w:noProof/>
+        </w:rPr>
         <w:drawing>
           <wp:inline distT="0" distB="0" distL="0" distR="0" wp14:anchorId="70E3ECB2" wp14:editId="73599346">
             <wp:extent cx="5940425" cy="690245"/>
@@ -3433,13 +3489,14 @@
       </w:pPr>
       <w:r>
         <w:rPr>
+          <w:noProof/>
           <w:lang w:val="en-US"/>
         </w:rPr>
         <w:drawing>
-          <wp:inline distT="0" distB="0" distL="0" distR="0" wp14:anchorId="468BDD84" wp14:editId="0F6611D1">
-            <wp:extent cx="4271375" cy="2897046"/>
-            <wp:effectExtent l="0" t="0" r="0" b="0"/>
-            <wp:docPr id="4" name="Рисунок 4"/>
+          <wp:inline distT="0" distB="0" distL="0" distR="0" wp14:anchorId="4E11C79A" wp14:editId="409F9BA4">
+            <wp:extent cx="5940425" cy="5543550"/>
+            <wp:effectExtent l="0" t="0" r="3175" b="6350"/>
+            <wp:docPr id="2" name="Рисунок 2"/>
             <wp:cNvGraphicFramePr>
               <a:graphicFrameLocks xmlns:a="http://schemas.openxmlformats.org/drawingml/2006/main" noChangeAspect="1"/>
             </wp:cNvGraphicFramePr>
@@ -3459,7 +3516,7 @@
                   <pic:spPr>
                     <a:xfrm>
                       <a:off x="0" y="0"/>
-                      <a:ext cx="4291441" cy="2910656"/>
+                      <a:ext cx="5940425" cy="5543550"/>
                     </a:xfrm>
                     <a:prstGeom prst="rect">
                       <a:avLst/>
@@ -3483,53 +3540,35 @@
     <w:p>
       <w:pPr>
         <w:jc w:val="center"/>
-        <w:rPr>
-          <w:lang w:val="en-US"/>
-        </w:rPr>
       </w:pPr>
       <w:r>
         <w:t>Рисунок</w:t>
       </w:r>
       <w:r>
-        <w:rPr>
-          <w:lang w:val="en-US"/>
-        </w:rPr>
         <w:t xml:space="preserve"> 3 – </w:t>
       </w:r>
       <w:r>
         <w:t>Вывод</w:t>
       </w:r>
       <w:r>
-        <w:rPr>
-          <w:lang w:val="en-US"/>
-        </w:rPr>
         <w:t xml:space="preserve"> </w:t>
       </w:r>
       <w:r>
         <w:t>проверки</w:t>
       </w:r>
       <w:r>
-        <w:rPr>
-          <w:lang w:val="en-US"/>
-        </w:rPr>
         <w:t xml:space="preserve"> </w:t>
       </w:r>
       <w:r>
         <w:t>расположения</w:t>
       </w:r>
       <w:r>
-        <w:rPr>
-          <w:lang w:val="en-US"/>
-        </w:rPr>
         <w:t xml:space="preserve"> </w:t>
       </w:r>
       <w:r>
         <w:t>файлов</w:t>
       </w:r>
       <w:r>
-        <w:rPr>
-          <w:lang w:val="en-US"/>
-        </w:rPr>
         <w:t xml:space="preserve"> </w:t>
       </w:r>
       <w:r>
@@ -3540,9 +3579,6 @@
         <w:t>TEMPDB</w:t>
       </w:r>
       <w:r>
-        <w:rPr>
-          <w:lang w:val="en-US"/>
-        </w:rPr>
         <w:t xml:space="preserve"> </w:t>
       </w:r>
     </w:p>
@@ -3559,6 +3595,10 @@
         <w:jc w:val="center"/>
       </w:pPr>
       <w:r>
+        <w:rPr>
+          <w:noProof/>
+        </w:rPr>
+        <w:lastRenderedPageBreak/>
         <w:drawing>
           <wp:inline distT="0" distB="0" distL="0" distR="0" wp14:anchorId="2EFC14A5" wp14:editId="3D414656">
             <wp:extent cx="3509964" cy="2968668"/>
@@ -3692,7 +3732,6 @@
         <w:rPr>
           <w:b/>
         </w:rPr>
-        <w:lastRenderedPageBreak/>
         <w:t xml:space="preserve">3.3 Создание базы </w:t>
       </w:r>
       <w:r>
@@ -4214,7 +4253,13 @@
       </w:r>
       <w:proofErr w:type="spellEnd"/>
       <w:r>
-        <w:t xml:space="preserve"> — всего 7 таблиц, 9 внешних ключей) и вставляют тестовые данные. Скрипт 07_</w:t>
+        <w:t xml:space="preserve"> </w:t>
+      </w:r>
+      <w:r>
+        <w:t>–</w:t>
+      </w:r>
+      <w:r>
+        <w:t xml:space="preserve"> всего 7 таблиц, 9 внешних ключей) и вставляют тестовые данные. Скрипт 07_</w:t>
       </w:r>
       <w:r>
         <w:rPr>
@@ -4379,7 +4424,13 @@
       </w:r>
       <w:proofErr w:type="spellEnd"/>
       <w:r>
-        <w:t xml:space="preserve"> — скриптом 08_</w:t>
+        <w:t xml:space="preserve"> </w:t>
+      </w:r>
+      <w:r>
+        <w:t>–</w:t>
+      </w:r>
+      <w:r>
+        <w:t xml:space="preserve"> скриптом 08_</w:t>
       </w:r>
       <w:r>
         <w:rPr>
@@ -4420,10 +4471,14 @@
         <w:jc w:val="center"/>
       </w:pPr>
       <w:r>
+        <w:rPr>
+          <w:noProof/>
+        </w:rPr>
+        <w:lastRenderedPageBreak/>
         <w:drawing>
-          <wp:inline distT="0" distB="0" distL="0" distR="0" wp14:anchorId="00B445D8" wp14:editId="5BBB8A64">
-            <wp:extent cx="5389279" cy="4609835"/>
-            <wp:effectExtent l="0" t="0" r="0" b="635"/>
+          <wp:inline distT="0" distB="0" distL="0" distR="0" wp14:anchorId="00B445D8" wp14:editId="7CD9497E">
+            <wp:extent cx="3870542" cy="3310750"/>
+            <wp:effectExtent l="0" t="0" r="3175" b="4445"/>
             <wp:docPr id="6" name="Рисунок 6"/>
             <wp:cNvGraphicFramePr>
               <a:graphicFrameLocks xmlns:a="http://schemas.openxmlformats.org/drawingml/2006/main" noChangeAspect="1"/>
@@ -4444,7 +4499,7 @@
                   <pic:spPr>
                     <a:xfrm>
                       <a:off x="0" y="0"/>
-                      <a:ext cx="5453253" cy="4664556"/>
+                      <a:ext cx="3936922" cy="3367529"/>
                     </a:xfrm>
                     <a:prstGeom prst="rect">
                       <a:avLst/>
@@ -4512,11 +4567,13 @@
         <w:jc w:val="center"/>
       </w:pPr>
       <w:r>
-        <w:lastRenderedPageBreak/>
+        <w:rPr>
+          <w:noProof/>
+        </w:rPr>
         <w:drawing>
-          <wp:inline distT="0" distB="0" distL="0" distR="0" wp14:anchorId="05F229FF" wp14:editId="3491E0F4">
-            <wp:extent cx="5668966" cy="6350695"/>
-            <wp:effectExtent l="0" t="0" r="0" b="0"/>
+          <wp:inline distT="0" distB="0" distL="0" distR="0" wp14:anchorId="05F229FF" wp14:editId="4CE8AC58">
+            <wp:extent cx="3983276" cy="4462290"/>
+            <wp:effectExtent l="0" t="0" r="5080" b="0"/>
             <wp:docPr id="7" name="Рисунок 7"/>
             <wp:cNvGraphicFramePr>
               <a:graphicFrameLocks xmlns:a="http://schemas.openxmlformats.org/drawingml/2006/main" noChangeAspect="1"/>
@@ -4537,7 +4594,7 @@
                   <pic:spPr>
                     <a:xfrm>
                       <a:off x="0" y="0"/>
-                      <a:ext cx="5688194" cy="6372235"/>
+                      <a:ext cx="4005874" cy="4487606"/>
                     </a:xfrm>
                     <a:prstGeom prst="rect">
                       <a:avLst/>
@@ -4927,7 +4984,6 @@
       </w:r>
       <w:proofErr w:type="spellStart"/>
       <w:r>
-        <w:lastRenderedPageBreak/>
         <w:t>файлгруппой</w:t>
       </w:r>
       <w:proofErr w:type="spellEnd"/>
@@ -5022,6 +5078,9 @@
         <w:jc w:val="center"/>
       </w:pPr>
       <w:r>
+        <w:rPr>
+          <w:noProof/>
+        </w:rPr>
         <w:drawing>
           <wp:inline distT="0" distB="0" distL="0" distR="0" wp14:anchorId="7F0C5757" wp14:editId="0430942A">
             <wp:extent cx="5693150" cy="3933172"/>
@@ -5133,7 +5192,13 @@
         <w:jc w:val="both"/>
       </w:pPr>
       <w:r>
-        <w:t xml:space="preserve">В результате выполнения данной лабораторной работы была достигнута поставленная цель — получение практических навыков управления файлами баз данных и настройки </w:t>
+        <w:t xml:space="preserve">В результате выполнения данной лабораторной работы была достигнута поставленная цель </w:t>
+      </w:r>
+      <w:r>
+        <w:t>–</w:t>
+      </w:r>
+      <w:r>
+        <w:t xml:space="preserve"> получение практических навыков управления файлами баз данных и настройки </w:t>
       </w:r>
       <w:r>
         <w:rPr>
@@ -6390,6 +6455,76 @@
     <w:unhideWhenUsed/>
     <w:rsid w:val="00E74573"/>
   </w:style>
+  <w:style w:type="character" w:styleId="a8">
+    <w:name w:val="annotation reference"/>
+    <w:basedOn w:val="a0"/>
+    <w:uiPriority w:val="99"/>
+    <w:semiHidden/>
+    <w:unhideWhenUsed/>
+    <w:rsid w:val="006F727C"/>
+    <w:rPr>
+      <w:sz w:val="16"/>
+      <w:szCs w:val="16"/>
+    </w:rPr>
+  </w:style>
+  <w:style w:type="paragraph" w:styleId="a9">
+    <w:name w:val="annotation text"/>
+    <w:basedOn w:val="a"/>
+    <w:link w:val="aa"/>
+    <w:uiPriority w:val="99"/>
+    <w:semiHidden/>
+    <w:unhideWhenUsed/>
+    <w:rsid w:val="006F727C"/>
+    <w:pPr>
+      <w:spacing w:line="240" w:lineRule="auto"/>
+    </w:pPr>
+    <w:rPr>
+      <w:sz w:val="20"/>
+      <w:szCs w:val="20"/>
+    </w:rPr>
+  </w:style>
+  <w:style w:type="character" w:customStyle="1" w:styleId="aa">
+    <w:name w:val="Текст примечания Знак"/>
+    <w:basedOn w:val="a0"/>
+    <w:link w:val="a9"/>
+    <w:uiPriority w:val="99"/>
+    <w:semiHidden/>
+    <w:rsid w:val="006F727C"/>
+    <w:rPr>
+      <w:rFonts w:ascii="Times New Roman" w:hAnsi="Times New Roman"/>
+      <w:sz w:val="20"/>
+      <w:szCs w:val="20"/>
+    </w:rPr>
+  </w:style>
+  <w:style w:type="paragraph" w:styleId="ab">
+    <w:name w:val="annotation subject"/>
+    <w:basedOn w:val="a9"/>
+    <w:next w:val="a9"/>
+    <w:link w:val="ac"/>
+    <w:uiPriority w:val="99"/>
+    <w:semiHidden/>
+    <w:unhideWhenUsed/>
+    <w:rsid w:val="006F727C"/>
+    <w:rPr>
+      <w:b/>
+      <w:bCs/>
+    </w:rPr>
+  </w:style>
+  <w:style w:type="character" w:customStyle="1" w:styleId="ac">
+    <w:name w:val="Тема примечания Знак"/>
+    <w:basedOn w:val="aa"/>
+    <w:link w:val="ab"/>
+    <w:uiPriority w:val="99"/>
+    <w:semiHidden/>
+    <w:rsid w:val="006F727C"/>
+    <w:rPr>
+      <w:rFonts w:ascii="Times New Roman" w:hAnsi="Times New Roman"/>
+      <w:b/>
+      <w:bCs/>
+      <w:sz w:val="20"/>
+      <w:szCs w:val="20"/>
+    </w:rPr>
+  </w:style>
 </w:styles>
 </file>
 

</xml_diff>